<commit_message>
Final commit real 100%
</commit_message>
<xml_diff>
--- a/doc/Relazione.docx
+++ b/doc/Relazione.docx
@@ -144,43 +144,7 @@
           <w:szCs w:val="26"/>
           <w:lang w:eastAsia="it-IT"/>
         </w:rPr>
-        <w:t xml:space="preserve">Remote Hydrometer </w:t>
-      </w:r>
-      <w:r>
-        <w:rPr>
-          <w:rFonts w:eastAsia="Times New Roman" w:cstheme="minorHAnsi"/>
-          <w:b/>
-          <w:bCs/>
-          <w:color w:val="000000"/>
-          <w:sz w:val="26"/>
-          <w:szCs w:val="26"/>
-          <w:lang w:eastAsia="it-IT"/>
-        </w:rPr>
-        <w:t>(</w:t>
-      </w:r>
-      <w:r>
-        <w:rPr>
-          <w:rFonts w:eastAsia="Times New Roman" w:cstheme="minorHAnsi"/>
-          <w:b/>
-          <w:bCs/>
-          <w:color w:val="000000"/>
-          <w:sz w:val="26"/>
-          <w:szCs w:val="26"/>
-          <w:lang w:eastAsia="it-IT"/>
-        </w:rPr>
-        <w:t>RH</w:t>
-      </w:r>
-      <w:r>
-        <w:rPr>
-          <w:rFonts w:eastAsia="Times New Roman" w:cstheme="minorHAnsi"/>
-          <w:b/>
-          <w:bCs/>
-          <w:color w:val="000000"/>
-          <w:sz w:val="26"/>
-          <w:szCs w:val="26"/>
-          <w:lang w:eastAsia="it-IT"/>
-        </w:rPr>
-        <w:t>):</w:t>
+        <w:t>Remote Hydrometer (RH):</w:t>
       </w:r>
     </w:p>
     <w:p>
@@ -444,7 +408,7 @@
           <w:szCs w:val="26"/>
           <w:lang w:eastAsia="it-IT"/>
         </w:rPr>
-        <w:t>http</w:t>
+        <w:t>HTTP</w:t>
       </w:r>
       <w:r>
         <w:rPr>
@@ -496,7 +460,7 @@
           <w:szCs w:val="26"/>
           <w:lang w:eastAsia="it-IT"/>
         </w:rPr>
-        <w:t>json</w:t>
+        <w:t>JSON</w:t>
       </w:r>
       <w:r>
         <w:rPr>
@@ -531,22 +495,24 @@
       <w:r>
         <w:rPr>
           <w:rFonts w:eastAsia="Times New Roman" w:cstheme="minorHAnsi"/>
-          <w:color w:val="000000"/>
-          <w:sz w:val="26"/>
-          <w:szCs w:val="26"/>
-          <w:lang w:eastAsia="it-IT"/>
-        </w:rPr>
-        <w:t>WifiData</w:t>
-      </w:r>
-      <w:r>
-        <w:rPr>
-          <w:rFonts w:eastAsia="Times New Roman" w:cstheme="minorHAnsi"/>
-          <w:color w:val="000000"/>
-          <w:sz w:val="26"/>
-          <w:szCs w:val="26"/>
-          <w:lang w:eastAsia="it-IT"/>
-        </w:rPr>
-        <w:t>.h.</w:t>
+          <w:i/>
+          <w:iCs/>
+          <w:color w:val="000000"/>
+          <w:sz w:val="26"/>
+          <w:szCs w:val="26"/>
+          <w:lang w:eastAsia="it-IT"/>
+        </w:rPr>
+        <w:t>WifiData.h</w:t>
+      </w:r>
+      <w:r>
+        <w:rPr>
+          <w:rFonts w:eastAsia="Times New Roman" w:cstheme="minorHAnsi"/>
+          <w:color w:val="000000"/>
+          <w:sz w:val="26"/>
+          <w:szCs w:val="26"/>
+          <w:lang w:eastAsia="it-IT"/>
+        </w:rPr>
+        <w:t>.</w:t>
       </w:r>
     </w:p>
     <w:p>
@@ -602,43 +568,7 @@
           <w:szCs w:val="26"/>
           <w:lang w:eastAsia="it-IT"/>
         </w:rPr>
-        <w:t xml:space="preserve">Dam Service </w:t>
-      </w:r>
-      <w:r>
-        <w:rPr>
-          <w:rFonts w:eastAsia="Times New Roman" w:cstheme="minorHAnsi"/>
-          <w:b/>
-          <w:bCs/>
-          <w:color w:val="000000"/>
-          <w:sz w:val="26"/>
-          <w:szCs w:val="26"/>
-          <w:lang w:eastAsia="it-IT"/>
-        </w:rPr>
-        <w:t>(</w:t>
-      </w:r>
-      <w:r>
-        <w:rPr>
-          <w:rFonts w:eastAsia="Times New Roman" w:cstheme="minorHAnsi"/>
-          <w:b/>
-          <w:bCs/>
-          <w:color w:val="000000"/>
-          <w:sz w:val="26"/>
-          <w:szCs w:val="26"/>
-          <w:lang w:eastAsia="it-IT"/>
-        </w:rPr>
-        <w:t>DS</w:t>
-      </w:r>
-      <w:r>
-        <w:rPr>
-          <w:rFonts w:eastAsia="Times New Roman" w:cstheme="minorHAnsi"/>
-          <w:b/>
-          <w:bCs/>
-          <w:color w:val="000000"/>
-          <w:sz w:val="26"/>
-          <w:szCs w:val="26"/>
-          <w:lang w:eastAsia="it-IT"/>
-        </w:rPr>
-        <w:t>):</w:t>
+        <w:t>Dam Service (DS):</w:t>
       </w:r>
     </w:p>
     <w:p>
@@ -726,7 +656,76 @@
           <w:sz w:val="26"/>
           <w:szCs w:val="26"/>
         </w:rPr>
-        <w:t>servizio</w:t>
+        <w:t xml:space="preserve">servizio </w:t>
+      </w:r>
+      <w:r>
+        <w:rPr>
+          <w:rFonts w:cstheme="minorHAnsi"/>
+          <w:b/>
+          <w:bCs/>
+          <w:color w:val="000000"/>
+          <w:sz w:val="26"/>
+          <w:szCs w:val="26"/>
+        </w:rPr>
+        <w:t>REST</w:t>
+      </w:r>
+      <w:r>
+        <w:rPr>
+          <w:rFonts w:cstheme="minorHAnsi"/>
+          <w:color w:val="000000"/>
+          <w:sz w:val="26"/>
+          <w:szCs w:val="26"/>
+        </w:rPr>
+        <w:t xml:space="preserve">. Esso interagisce via </w:t>
+      </w:r>
+      <w:r>
+        <w:rPr>
+          <w:rFonts w:cstheme="minorHAnsi"/>
+          <w:b/>
+          <w:bCs/>
+          <w:color w:val="000000"/>
+          <w:sz w:val="26"/>
+          <w:szCs w:val="26"/>
+        </w:rPr>
+        <w:t>seriale</w:t>
+      </w:r>
+      <w:r>
+        <w:rPr>
+          <w:rFonts w:cstheme="minorHAnsi"/>
+          <w:color w:val="000000"/>
+          <w:sz w:val="26"/>
+          <w:szCs w:val="26"/>
+        </w:rPr>
+        <w:t xml:space="preserve"> con il sottosistema </w:t>
+      </w:r>
+      <w:r>
+        <w:rPr>
+          <w:rFonts w:cstheme="minorHAnsi"/>
+          <w:b/>
+          <w:bCs/>
+          <w:color w:val="000000"/>
+          <w:sz w:val="26"/>
+          <w:szCs w:val="26"/>
+        </w:rPr>
+        <w:t>DC</w:t>
+      </w:r>
+      <w:r>
+        <w:rPr>
+          <w:rFonts w:cstheme="minorHAnsi"/>
+          <w:color w:val="000000"/>
+          <w:sz w:val="26"/>
+          <w:szCs w:val="26"/>
+        </w:rPr>
+        <w:t>, con i sottosistem</w:t>
+      </w:r>
+      <w:r>
+        <w:rPr>
+          <w:rFonts w:cstheme="minorHAnsi"/>
+          <w:color w:val="000000"/>
+          <w:sz w:val="26"/>
+          <w:szCs w:val="26"/>
+        </w:rPr>
+        <w:t>i</w:t>
       </w:r>
       <w:r>
         <w:rPr>
@@ -746,7 +745,87 @@
           <w:sz w:val="26"/>
           <w:szCs w:val="26"/>
         </w:rPr>
-        <w:t>REST</w:t>
+        <w:t>RH</w:t>
+      </w:r>
+      <w:r>
+        <w:rPr>
+          <w:rFonts w:cstheme="minorHAnsi"/>
+          <w:b/>
+          <w:bCs/>
+          <w:color w:val="000000"/>
+          <w:sz w:val="26"/>
+          <w:szCs w:val="26"/>
+        </w:rPr>
+        <w:t xml:space="preserve"> </w:t>
+      </w:r>
+      <w:r>
+        <w:rPr>
+          <w:rFonts w:cstheme="minorHAnsi"/>
+          <w:color w:val="000000"/>
+          <w:sz w:val="26"/>
+          <w:szCs w:val="26"/>
+        </w:rPr>
+        <w:t xml:space="preserve">e </w:t>
+      </w:r>
+      <w:r>
+        <w:rPr>
+          <w:rFonts w:cstheme="minorHAnsi"/>
+          <w:b/>
+          <w:bCs/>
+          <w:color w:val="000000"/>
+          <w:sz w:val="26"/>
+          <w:szCs w:val="26"/>
+        </w:rPr>
+        <w:t>DD</w:t>
+      </w:r>
+      <w:r>
+        <w:rPr>
+          <w:rFonts w:cstheme="minorHAnsi"/>
+          <w:color w:val="000000"/>
+          <w:sz w:val="26"/>
+          <w:szCs w:val="26"/>
+        </w:rPr>
+        <w:t xml:space="preserve"> </w:t>
+      </w:r>
+      <w:r>
+        <w:rPr>
+          <w:rFonts w:cstheme="minorHAnsi"/>
+          <w:color w:val="000000"/>
+          <w:sz w:val="26"/>
+          <w:szCs w:val="26"/>
+        </w:rPr>
+        <w:t xml:space="preserve">via </w:t>
+      </w:r>
+      <w:r>
+        <w:rPr>
+          <w:rFonts w:cstheme="minorHAnsi"/>
+          <w:b/>
+          <w:bCs/>
+          <w:color w:val="000000"/>
+          <w:sz w:val="26"/>
+          <w:szCs w:val="26"/>
+        </w:rPr>
+        <w:t>HTTP</w:t>
+      </w:r>
+      <w:r>
+        <w:rPr>
+          <w:rFonts w:cstheme="minorHAnsi"/>
+          <w:color w:val="000000"/>
+          <w:sz w:val="26"/>
+          <w:szCs w:val="26"/>
+        </w:rPr>
+        <w:t xml:space="preserve"> attraverso delle stringhe in formato </w:t>
+      </w:r>
+      <w:r>
+        <w:rPr>
+          <w:rFonts w:cstheme="minorHAnsi"/>
+          <w:b/>
+          <w:bCs/>
+          <w:color w:val="000000"/>
+          <w:sz w:val="26"/>
+          <w:szCs w:val="26"/>
+        </w:rPr>
+        <w:t>json</w:t>
       </w:r>
       <w:r>
         <w:rPr>
@@ -756,218 +835,6 @@
           <w:szCs w:val="26"/>
         </w:rPr>
         <w:t xml:space="preserve">. </w:t>
-      </w:r>
-      <w:r>
-        <w:rPr>
-          <w:rFonts w:cstheme="minorHAnsi"/>
-          <w:color w:val="000000"/>
-          <w:sz w:val="26"/>
-          <w:szCs w:val="26"/>
-        </w:rPr>
-        <w:t>Esso i</w:t>
-      </w:r>
-      <w:r>
-        <w:rPr>
-          <w:rFonts w:cstheme="minorHAnsi"/>
-          <w:color w:val="000000"/>
-          <w:sz w:val="26"/>
-          <w:szCs w:val="26"/>
-        </w:rPr>
-        <w:t xml:space="preserve">nteragisce via </w:t>
-      </w:r>
-      <w:r>
-        <w:rPr>
-          <w:rFonts w:cstheme="minorHAnsi"/>
-          <w:b/>
-          <w:bCs/>
-          <w:color w:val="000000"/>
-          <w:sz w:val="26"/>
-          <w:szCs w:val="26"/>
-        </w:rPr>
-        <w:t>seriale</w:t>
-      </w:r>
-      <w:r>
-        <w:rPr>
-          <w:rFonts w:cstheme="minorHAnsi"/>
-          <w:color w:val="000000"/>
-          <w:sz w:val="26"/>
-          <w:szCs w:val="26"/>
-        </w:rPr>
-        <w:t xml:space="preserve"> con il</w:t>
-      </w:r>
-      <w:r>
-        <w:rPr>
-          <w:rFonts w:cstheme="minorHAnsi"/>
-          <w:color w:val="000000"/>
-          <w:sz w:val="26"/>
-          <w:szCs w:val="26"/>
-        </w:rPr>
-        <w:t xml:space="preserve"> sottosistema </w:t>
-      </w:r>
-      <w:r>
-        <w:rPr>
-          <w:rFonts w:cstheme="minorHAnsi"/>
-          <w:b/>
-          <w:bCs/>
-          <w:color w:val="000000"/>
-          <w:sz w:val="26"/>
-          <w:szCs w:val="26"/>
-        </w:rPr>
-        <w:t>D</w:t>
-      </w:r>
-      <w:r>
-        <w:rPr>
-          <w:rFonts w:cstheme="minorHAnsi"/>
-          <w:b/>
-          <w:bCs/>
-          <w:color w:val="000000"/>
-          <w:sz w:val="26"/>
-          <w:szCs w:val="26"/>
-        </w:rPr>
-        <w:t>C</w:t>
-      </w:r>
-      <w:r>
-        <w:rPr>
-          <w:rFonts w:cstheme="minorHAnsi"/>
-          <w:color w:val="000000"/>
-          <w:sz w:val="26"/>
-          <w:szCs w:val="26"/>
-        </w:rPr>
-        <w:t xml:space="preserve">, </w:t>
-      </w:r>
-      <w:r>
-        <w:rPr>
-          <w:rFonts w:cstheme="minorHAnsi"/>
-          <w:color w:val="000000"/>
-          <w:sz w:val="26"/>
-          <w:szCs w:val="26"/>
-        </w:rPr>
-        <w:t xml:space="preserve">con il </w:t>
-      </w:r>
-      <w:r>
-        <w:rPr>
-          <w:rFonts w:cstheme="minorHAnsi"/>
-          <w:color w:val="000000"/>
-          <w:sz w:val="26"/>
-          <w:szCs w:val="26"/>
-        </w:rPr>
-        <w:t xml:space="preserve">sottosistema </w:t>
-      </w:r>
-      <w:r>
-        <w:rPr>
-          <w:rFonts w:cstheme="minorHAnsi"/>
-          <w:b/>
-          <w:bCs/>
-          <w:color w:val="000000"/>
-          <w:sz w:val="26"/>
-          <w:szCs w:val="26"/>
-        </w:rPr>
-        <w:t>RH</w:t>
-      </w:r>
-      <w:r>
-        <w:rPr>
-          <w:rFonts w:cstheme="minorHAnsi"/>
-          <w:color w:val="000000"/>
-          <w:sz w:val="26"/>
-          <w:szCs w:val="26"/>
-        </w:rPr>
-        <w:t xml:space="preserve"> via </w:t>
-      </w:r>
-      <w:r>
-        <w:rPr>
-          <w:rFonts w:cstheme="minorHAnsi"/>
-          <w:b/>
-          <w:bCs/>
-          <w:color w:val="000000"/>
-          <w:sz w:val="26"/>
-          <w:szCs w:val="26"/>
-        </w:rPr>
-        <w:t>HTTP</w:t>
-      </w:r>
-      <w:r>
-        <w:rPr>
-          <w:rFonts w:cstheme="minorHAnsi"/>
-          <w:color w:val="000000"/>
-          <w:sz w:val="26"/>
-          <w:szCs w:val="26"/>
-        </w:rPr>
-        <w:t xml:space="preserve"> </w:t>
-      </w:r>
-      <w:r>
-        <w:rPr>
-          <w:rFonts w:cstheme="minorHAnsi"/>
-          <w:color w:val="000000"/>
-          <w:sz w:val="26"/>
-          <w:szCs w:val="26"/>
-        </w:rPr>
-        <w:t xml:space="preserve">e con </w:t>
-      </w:r>
-      <w:r>
-        <w:rPr>
-          <w:rFonts w:cstheme="minorHAnsi"/>
-          <w:color w:val="000000"/>
-          <w:sz w:val="26"/>
-          <w:szCs w:val="26"/>
-        </w:rPr>
-        <w:t xml:space="preserve">il sottosistema </w:t>
-      </w:r>
-      <w:r>
-        <w:rPr>
-          <w:rFonts w:cstheme="minorHAnsi"/>
-          <w:b/>
-          <w:bCs/>
-          <w:color w:val="000000"/>
-          <w:sz w:val="26"/>
-          <w:szCs w:val="26"/>
-        </w:rPr>
-        <w:t>DD</w:t>
-      </w:r>
-      <w:r>
-        <w:rPr>
-          <w:rFonts w:cstheme="minorHAnsi"/>
-          <w:color w:val="000000"/>
-          <w:sz w:val="26"/>
-          <w:szCs w:val="26"/>
-        </w:rPr>
-        <w:t xml:space="preserve"> </w:t>
-      </w:r>
-      <w:r>
-        <w:rPr>
-          <w:rFonts w:cstheme="minorHAnsi"/>
-          <w:color w:val="000000"/>
-          <w:sz w:val="26"/>
-          <w:szCs w:val="26"/>
-        </w:rPr>
-        <w:t xml:space="preserve">attraverso delle stringhe in formato </w:t>
-      </w:r>
-      <w:r>
-        <w:rPr>
-          <w:rFonts w:cstheme="minorHAnsi"/>
-          <w:b/>
-          <w:bCs/>
-          <w:color w:val="000000"/>
-          <w:sz w:val="26"/>
-          <w:szCs w:val="26"/>
-        </w:rPr>
-        <w:t>json</w:t>
-      </w:r>
-      <w:r>
-        <w:rPr>
-          <w:rFonts w:cstheme="minorHAnsi"/>
-          <w:color w:val="000000"/>
-          <w:sz w:val="26"/>
-          <w:szCs w:val="26"/>
-        </w:rPr>
-        <w:t>.</w:t>
-      </w:r>
-      <w:r>
-        <w:rPr>
-          <w:rFonts w:cstheme="minorHAnsi"/>
-          <w:color w:val="000000"/>
-          <w:sz w:val="26"/>
-          <w:szCs w:val="26"/>
-        </w:rPr>
-        <w:t xml:space="preserve"> </w:t>
       </w:r>
     </w:p>
     <w:p>
@@ -1048,7 +915,25 @@
           <w:sz w:val="26"/>
           <w:szCs w:val="26"/>
         </w:rPr>
-        <w:t xml:space="preserve">, che si occupa di gestire le richieste http </w:t>
+        <w:t xml:space="preserve">, che si occupa di gestire le richieste </w:t>
+      </w:r>
+      <w:r>
+        <w:rPr>
+          <w:rFonts w:cstheme="minorHAnsi"/>
+          <w:color w:val="000000"/>
+          <w:sz w:val="26"/>
+          <w:szCs w:val="26"/>
+        </w:rPr>
+        <w:t>HTTP</w:t>
+      </w:r>
+      <w:r>
+        <w:rPr>
+          <w:rFonts w:cstheme="minorHAnsi"/>
+          <w:color w:val="000000"/>
+          <w:sz w:val="26"/>
+          <w:szCs w:val="26"/>
+        </w:rPr>
+        <w:t xml:space="preserve"> </w:t>
       </w:r>
       <w:r>
         <w:rPr>
@@ -1088,7 +973,79 @@
           <w:sz w:val="26"/>
           <w:szCs w:val="26"/>
         </w:rPr>
-        <w:t xml:space="preserve"> (da parte di DD). Quando viene ricevuto un nuovo dato da RH vengono inviati i dati al sottosistema DC, il quale aggiunge ulteriori dati prima di metterli a disposizione del sottosistema DD. </w:t>
+        <w:t xml:space="preserve"> (da parte di DD). Quando v</w:t>
+      </w:r>
+      <w:r>
+        <w:rPr>
+          <w:rFonts w:cstheme="minorHAnsi"/>
+          <w:color w:val="000000"/>
+          <w:sz w:val="26"/>
+          <w:szCs w:val="26"/>
+        </w:rPr>
+        <w:t>engono</w:t>
+      </w:r>
+      <w:r>
+        <w:rPr>
+          <w:rFonts w:cstheme="minorHAnsi"/>
+          <w:color w:val="000000"/>
+          <w:sz w:val="26"/>
+          <w:szCs w:val="26"/>
+        </w:rPr>
+        <w:t xml:space="preserve"> ricevut</w:t>
+      </w:r>
+      <w:r>
+        <w:rPr>
+          <w:rFonts w:cstheme="minorHAnsi"/>
+          <w:color w:val="000000"/>
+          <w:sz w:val="26"/>
+          <w:szCs w:val="26"/>
+        </w:rPr>
+        <w:t>i</w:t>
+      </w:r>
+      <w:r>
+        <w:rPr>
+          <w:rFonts w:cstheme="minorHAnsi"/>
+          <w:color w:val="000000"/>
+          <w:sz w:val="26"/>
+          <w:szCs w:val="26"/>
+        </w:rPr>
+        <w:t xml:space="preserve"> nuov</w:t>
+      </w:r>
+      <w:r>
+        <w:rPr>
+          <w:rFonts w:cstheme="minorHAnsi"/>
+          <w:color w:val="000000"/>
+          <w:sz w:val="26"/>
+          <w:szCs w:val="26"/>
+        </w:rPr>
+        <w:t>i</w:t>
+      </w:r>
+      <w:r>
+        <w:rPr>
+          <w:rFonts w:cstheme="minorHAnsi"/>
+          <w:color w:val="000000"/>
+          <w:sz w:val="26"/>
+          <w:szCs w:val="26"/>
+        </w:rPr>
+        <w:t xml:space="preserve"> dat</w:t>
+      </w:r>
+      <w:r>
+        <w:rPr>
+          <w:rFonts w:cstheme="minorHAnsi"/>
+          <w:color w:val="000000"/>
+          <w:sz w:val="26"/>
+          <w:szCs w:val="26"/>
+        </w:rPr>
+        <w:t>i</w:t>
+      </w:r>
+      <w:r>
+        <w:rPr>
+          <w:rFonts w:cstheme="minorHAnsi"/>
+          <w:color w:val="000000"/>
+          <w:sz w:val="26"/>
+          <w:szCs w:val="26"/>
+        </w:rPr>
+        <w:t xml:space="preserve"> da RH vengono inviati al sottosistema DC, il quale aggiunge ulteriori dati prima di metterli a disposizione del sottosistema DD. </w:t>
       </w:r>
     </w:p>
     <w:p>
@@ -1134,43 +1091,7 @@
           <w:szCs w:val="26"/>
           <w:lang w:eastAsia="it-IT"/>
         </w:rPr>
-        <w:t xml:space="preserve">Dam Controller </w:t>
-      </w:r>
-      <w:r>
-        <w:rPr>
-          <w:rFonts w:eastAsia="Times New Roman" w:cstheme="minorHAnsi"/>
-          <w:b/>
-          <w:bCs/>
-          <w:color w:val="000000"/>
-          <w:sz w:val="26"/>
-          <w:szCs w:val="26"/>
-          <w:lang w:eastAsia="it-IT"/>
-        </w:rPr>
-        <w:t>(</w:t>
-      </w:r>
-      <w:r>
-        <w:rPr>
-          <w:rFonts w:eastAsia="Times New Roman" w:cstheme="minorHAnsi"/>
-          <w:b/>
-          <w:bCs/>
-          <w:color w:val="000000"/>
-          <w:sz w:val="26"/>
-          <w:szCs w:val="26"/>
-          <w:lang w:eastAsia="it-IT"/>
-        </w:rPr>
-        <w:t>DC</w:t>
-      </w:r>
-      <w:r>
-        <w:rPr>
-          <w:rFonts w:eastAsia="Times New Roman" w:cstheme="minorHAnsi"/>
-          <w:b/>
-          <w:bCs/>
-          <w:color w:val="000000"/>
-          <w:sz w:val="26"/>
-          <w:szCs w:val="26"/>
-          <w:lang w:eastAsia="it-IT"/>
-        </w:rPr>
-        <w:t>):</w:t>
+        <w:t>Dam Controller (DC):</w:t>
       </w:r>
     </w:p>
     <w:p>
@@ -1329,7 +1250,83 @@
           <w:szCs w:val="26"/>
           <w:lang w:eastAsia="it-IT"/>
         </w:rPr>
-        <w:t>gestiti da una classe State. In aggiunta il sistema presenta due ulteriori stati MANUAL e AUTO, ad indicare lo stato di controllo manuale o automatico dell’apertura della diga (costituita dal servo motore), comunicato da DM. La comunicazione con il sistema DM viene gestita da CommTask ed avviene attraverso un modulo Bluetooth HC-05, il quale invia i dati relativi a stato del sistema, ultima rilevazione di RH (solo se in PRE_ALARM e ALARM) e apertura della diga (se in ALARM) e riceve richiest</w:t>
+        <w:t xml:space="preserve">gestiti da una classe State. In aggiunta il sistema presenta due ulteriori stati </w:t>
+      </w:r>
+      <w:r>
+        <w:rPr>
+          <w:rFonts w:eastAsia="Times New Roman" w:cstheme="minorHAnsi"/>
+          <w:b/>
+          <w:bCs/>
+          <w:color w:val="000000"/>
+          <w:sz w:val="26"/>
+          <w:szCs w:val="26"/>
+          <w:lang w:eastAsia="it-IT"/>
+        </w:rPr>
+        <w:t>MANUAL</w:t>
+      </w:r>
+      <w:r>
+        <w:rPr>
+          <w:rFonts w:eastAsia="Times New Roman" w:cstheme="minorHAnsi"/>
+          <w:color w:val="000000"/>
+          <w:sz w:val="26"/>
+          <w:szCs w:val="26"/>
+          <w:lang w:eastAsia="it-IT"/>
+        </w:rPr>
+        <w:t xml:space="preserve"> e </w:t>
+      </w:r>
+      <w:r>
+        <w:rPr>
+          <w:rFonts w:eastAsia="Times New Roman" w:cstheme="minorHAnsi"/>
+          <w:b/>
+          <w:bCs/>
+          <w:color w:val="000000"/>
+          <w:sz w:val="26"/>
+          <w:szCs w:val="26"/>
+          <w:lang w:eastAsia="it-IT"/>
+        </w:rPr>
+        <w:t>AUTO</w:t>
+      </w:r>
+      <w:r>
+        <w:rPr>
+          <w:rFonts w:eastAsia="Times New Roman" w:cstheme="minorHAnsi"/>
+          <w:color w:val="000000"/>
+          <w:sz w:val="26"/>
+          <w:szCs w:val="26"/>
+          <w:lang w:eastAsia="it-IT"/>
+        </w:rPr>
+        <w:t xml:space="preserve">, ad indicare lo stato di controllo manuale o automatico dell’apertura della diga (costituita dal servo motore), comunicato da DM. La comunicazione con il sistema DM viene gestita da CommTask ed avviene attraverso un modulo </w:t>
+      </w:r>
+      <w:r>
+        <w:rPr>
+          <w:rFonts w:eastAsia="Times New Roman" w:cstheme="minorHAnsi"/>
+          <w:color w:val="000000"/>
+          <w:sz w:val="26"/>
+          <w:szCs w:val="26"/>
+          <w:lang w:eastAsia="it-IT"/>
+        </w:rPr>
+        <w:t>Bluetooth</w:t>
+      </w:r>
+      <w:r>
+        <w:rPr>
+          <w:rFonts w:eastAsia="Times New Roman" w:cstheme="minorHAnsi"/>
+          <w:b/>
+          <w:bCs/>
+          <w:color w:val="000000"/>
+          <w:sz w:val="26"/>
+          <w:szCs w:val="26"/>
+          <w:lang w:eastAsia="it-IT"/>
+        </w:rPr>
+        <w:t xml:space="preserve"> HC-05</w:t>
+      </w:r>
+      <w:r>
+        <w:rPr>
+          <w:rFonts w:eastAsia="Times New Roman" w:cstheme="minorHAnsi"/>
+          <w:color w:val="000000"/>
+          <w:sz w:val="26"/>
+          <w:szCs w:val="26"/>
+          <w:lang w:eastAsia="it-IT"/>
+        </w:rPr>
+        <w:t>, il quale invia i dati relativi a stato del sistema, ultima rilevazione di RH (solo se in PRE_ALARM e ALARM) e apertura della diga (se in ALARM) e riceve richiest</w:t>
       </w:r>
       <w:r>
         <w:rPr>
@@ -1423,38 +1420,68 @@
           <w:szCs w:val="26"/>
           <w:lang w:eastAsia="it-IT"/>
         </w:rPr>
+        <w:t>modificano</w:t>
+      </w:r>
+      <w:r>
+        <w:rPr>
+          <w:rFonts w:eastAsia="Times New Roman" w:cstheme="minorHAnsi"/>
+          <w:color w:val="000000"/>
+          <w:sz w:val="26"/>
+          <w:szCs w:val="26"/>
+          <w:lang w:eastAsia="it-IT"/>
+        </w:rPr>
+        <w:t xml:space="preserve"> lo </w:t>
+      </w:r>
+      <w:r>
+        <w:rPr>
+          <w:rFonts w:eastAsia="Times New Roman" w:cstheme="minorHAnsi"/>
+          <w:color w:val="000000"/>
+          <w:sz w:val="26"/>
+          <w:szCs w:val="26"/>
+          <w:lang w:eastAsia="it-IT"/>
+        </w:rPr>
         <w:lastRenderedPageBreak/>
-        <w:t>modificheranno</w:t>
-      </w:r>
-      <w:r>
-        <w:rPr>
-          <w:rFonts w:eastAsia="Times New Roman" w:cstheme="minorHAnsi"/>
-          <w:color w:val="000000"/>
-          <w:sz w:val="26"/>
-          <w:szCs w:val="26"/>
-          <w:lang w:eastAsia="it-IT"/>
-        </w:rPr>
-        <w:t xml:space="preserve"> lo stato del sistema e, in seguito, vengono inviati i dati al server, aggiungendo apertura e modalità di controllo </w:t>
-      </w:r>
-      <w:r>
-        <w:rPr>
-          <w:rFonts w:eastAsia="Times New Roman" w:cstheme="minorHAnsi"/>
-          <w:color w:val="000000"/>
-          <w:sz w:val="26"/>
-          <w:szCs w:val="26"/>
-          <w:lang w:eastAsia="it-IT"/>
-        </w:rPr>
-        <w:t>della diga</w:t>
-      </w:r>
-      <w:r>
-        <w:rPr>
-          <w:rFonts w:eastAsia="Times New Roman" w:cstheme="minorHAnsi"/>
-          <w:color w:val="000000"/>
-          <w:sz w:val="26"/>
-          <w:szCs w:val="26"/>
-          <w:lang w:eastAsia="it-IT"/>
-        </w:rPr>
-        <w:t>.</w:t>
+        <w:t>stato del sistema</w:t>
+      </w:r>
+      <w:r>
+        <w:rPr>
+          <w:rFonts w:eastAsia="Times New Roman" w:cstheme="minorHAnsi"/>
+          <w:color w:val="000000"/>
+          <w:sz w:val="26"/>
+          <w:szCs w:val="26"/>
+          <w:lang w:eastAsia="it-IT"/>
+        </w:rPr>
+        <w:t xml:space="preserve"> DC</w:t>
+      </w:r>
+      <w:r>
+        <w:rPr>
+          <w:rFonts w:eastAsia="Times New Roman" w:cstheme="minorHAnsi"/>
+          <w:color w:val="000000"/>
+          <w:sz w:val="26"/>
+          <w:szCs w:val="26"/>
+          <w:lang w:eastAsia="it-IT"/>
+        </w:rPr>
+        <w:t xml:space="preserve"> e, in seguito, vengono </w:t>
+      </w:r>
+      <w:r>
+        <w:rPr>
+          <w:rFonts w:eastAsia="Times New Roman" w:cstheme="minorHAnsi"/>
+          <w:color w:val="000000"/>
+          <w:sz w:val="26"/>
+          <w:szCs w:val="26"/>
+          <w:lang w:eastAsia="it-IT"/>
+        </w:rPr>
+        <w:t>r</w:t>
+      </w:r>
+      <w:r>
+        <w:rPr>
+          <w:rFonts w:eastAsia="Times New Roman" w:cstheme="minorHAnsi"/>
+          <w:color w:val="000000"/>
+          <w:sz w:val="26"/>
+          <w:szCs w:val="26"/>
+          <w:lang w:eastAsia="it-IT"/>
+        </w:rPr>
+        <w:t>inviati, aggiungendo apertura e modalità di controllo della diga.</w:t>
       </w:r>
     </w:p>
     <w:p>
@@ -1538,43 +1565,7 @@
           <w:szCs w:val="26"/>
           <w:lang w:eastAsia="it-IT"/>
         </w:rPr>
-        <w:t xml:space="preserve">App </w:t>
-      </w:r>
-      <w:r>
-        <w:rPr>
-          <w:rFonts w:eastAsia="Times New Roman" w:cstheme="minorHAnsi"/>
-          <w:b/>
-          <w:bCs/>
-          <w:color w:val="000000"/>
-          <w:sz w:val="26"/>
-          <w:szCs w:val="26"/>
-          <w:lang w:eastAsia="it-IT"/>
-        </w:rPr>
-        <w:t>(</w:t>
-      </w:r>
-      <w:r>
-        <w:rPr>
-          <w:rFonts w:eastAsia="Times New Roman" w:cstheme="minorHAnsi"/>
-          <w:b/>
-          <w:bCs/>
-          <w:color w:val="000000"/>
-          <w:sz w:val="26"/>
-          <w:szCs w:val="26"/>
-          <w:lang w:eastAsia="it-IT"/>
-        </w:rPr>
-        <w:t>D</w:t>
-      </w:r>
-      <w:r>
-        <w:rPr>
-          <w:rFonts w:eastAsia="Times New Roman" w:cstheme="minorHAnsi"/>
-          <w:b/>
-          <w:bCs/>
-          <w:color w:val="000000"/>
-          <w:sz w:val="26"/>
-          <w:szCs w:val="26"/>
-          <w:lang w:eastAsia="it-IT"/>
-        </w:rPr>
-        <w:t>M):</w:t>
+        <w:t>App (DM):</w:t>
       </w:r>
     </w:p>
     <w:p>
@@ -1683,19 +1674,7 @@
           <w:szCs w:val="26"/>
           <w:lang w:eastAsia="it-IT"/>
         </w:rPr>
-        <w:t>DD</w:t>
-      </w:r>
-      <w:r>
-        <w:rPr>
-          <w:rFonts w:eastAsia="Times New Roman" w:cstheme="minorHAnsi"/>
-          <w:b/>
-          <w:bCs/>
-          <w:color w:val="000000"/>
-          <w:sz w:val="26"/>
-          <w:szCs w:val="26"/>
-          <w:lang w:eastAsia="it-IT"/>
-        </w:rPr>
-        <w:t>):</w:t>
+        <w:t>DD):</w:t>
       </w:r>
     </w:p>
     <w:p>
@@ -1838,7 +1817,7 @@
         <v:path o:extrusionok="f" gradientshapeok="t" o:connecttype="rect"/>
         <o:lock v:ext="edit" aspectratio="t"/>
       </v:shapetype>
-      <v:shape id="_x0000_i1317" type="#_x0000_t75" style="width:11.25pt;height:11.25pt" o:bullet="t">
+      <v:shape id="_x0000_i1065" type="#_x0000_t75" style="width:11.2pt;height:11.2pt" o:bullet="t">
         <v:imagedata r:id="rId1" o:title="mso5E57"/>
       </v:shape>
     </w:pict>
@@ -2111,23 +2090,7 @@
   </w:num>
   <w:num w:numId="2">
     <w:abstractNumId w:val="1"/>
-    <w:lvlOverride w:ilvl="1">
-      <w:lvl w:ilvl="1">
-        <w:numFmt w:val="bullet"/>
-        <w:lvlText w:val=""/>
-        <w:lvlJc w:val="left"/>
-        <w:pPr>
-          <w:tabs>
-            <w:tab w:val="num" w:pos="1440"/>
-          </w:tabs>
-          <w:ind w:left="1440" w:hanging="360"/>
-        </w:pPr>
-        <w:rPr>
-          <w:rFonts w:ascii="Symbol" w:hAnsi="Symbol" w:hint="default"/>
-          <w:sz w:val="20"/>
-        </w:rPr>
-      </w:lvl>
-    </w:lvlOverride>
+    <w:lvlOverride w:ilvl="0"/>
   </w:num>
   <w:num w:numId="3">
     <w:abstractNumId w:val="0"/>
@@ -2258,6 +2221,7 @@
     <w:lsdException w:name="HTML Sample" w:semiHidden="1" w:unhideWhenUsed="1"/>
     <w:lsdException w:name="HTML Typewriter" w:semiHidden="1" w:unhideWhenUsed="1"/>
     <w:lsdException w:name="HTML Variable" w:semiHidden="1" w:unhideWhenUsed="1"/>
+    <w:lsdException w:name="Normal Table" w:semiHidden="1" w:unhideWhenUsed="1"/>
     <w:lsdException w:name="annotation subject" w:semiHidden="1" w:unhideWhenUsed="1"/>
     <w:lsdException w:name="No List" w:semiHidden="1" w:unhideWhenUsed="1"/>
     <w:lsdException w:name="Outline List 1" w:semiHidden="1" w:unhideWhenUsed="1"/>
@@ -2304,8 +2268,10 @@
     <w:lsdException w:name="Table Subtle 2" w:semiHidden="1" w:unhideWhenUsed="1"/>
     <w:lsdException w:name="Table Web 1" w:semiHidden="1" w:unhideWhenUsed="1"/>
     <w:lsdException w:name="Table Web 2" w:semiHidden="1" w:unhideWhenUsed="1"/>
+    <w:lsdException w:name="Table Web 3" w:semiHidden="1" w:unhideWhenUsed="1"/>
     <w:lsdException w:name="Balloon Text" w:semiHidden="1" w:unhideWhenUsed="1"/>
     <w:lsdException w:name="Table Grid" w:uiPriority="39"/>
+    <w:lsdException w:name="Table Theme" w:semiHidden="1" w:unhideWhenUsed="1"/>
     <w:lsdException w:name="Placeholder Text" w:semiHidden="1"/>
     <w:lsdException w:name="No Spacing" w:uiPriority="1" w:qFormat="1"/>
     <w:lsdException w:name="Light Shading" w:uiPriority="60"/>

</xml_diff>